<commit_message>
notes and pdf of report updated
</commit_message>
<xml_diff>
--- a/docs/notes.docx
+++ b/docs/notes.docx
@@ -18,15 +18,7 @@
       </w:r>
       <w:proofErr w:type="spellEnd"/>
       <w:r>
-        <w:t xml:space="preserve"> </w:t>
-      </w:r>
-      <w:proofErr w:type="gramStart"/>
-      <w:r>
-        <w:t>server :</w:t>
-      </w:r>
-      <w:proofErr w:type="gramEnd"/>
-      <w:r>
-        <w:t xml:space="preserve"> </w:t>
+        <w:t xml:space="preserve"> server : </w:t>
       </w:r>
       <w:r>
         <w:rPr>
@@ -46,15 +38,7 @@
       </w:r>
       <w:proofErr w:type="spellEnd"/>
       <w:r>
-        <w:t xml:space="preserve"> </w:t>
-      </w:r>
-      <w:proofErr w:type="gramStart"/>
-      <w:r>
-        <w:t>server :</w:t>
-      </w:r>
-      <w:proofErr w:type="gramEnd"/>
-      <w:r>
-        <w:t xml:space="preserve"> </w:t>
+        <w:t xml:space="preserve"> server : </w:t>
       </w:r>
       <w:r>
         <w:rPr>
@@ -90,15 +74,7 @@
       </w:r>
       <w:proofErr w:type="spellEnd"/>
       <w:r>
-        <w:t xml:space="preserve"> </w:t>
-      </w:r>
-      <w:proofErr w:type="gramStart"/>
-      <w:r>
-        <w:t>key :</w:t>
-      </w:r>
-      <w:proofErr w:type="gramEnd"/>
-      <w:r>
-        <w:t xml:space="preserve"> </w:t>
+        <w:t xml:space="preserve"> key : </w:t>
       </w:r>
       <w:hyperlink r:id="rId5" w:history="1">
         <w:r>
@@ -155,7 +131,6 @@
         </w:rPr>
         <w:t>Pre-</w:t>
       </w:r>
-      <w:proofErr w:type="gramStart"/>
       <w:r>
         <w:rPr>
           <w:b/>
@@ -163,7 +138,6 @@
         </w:rPr>
         <w:t>step :</w:t>
       </w:r>
-      <w:proofErr w:type="gramEnd"/>
       <w:r>
         <w:rPr>
           <w:b/>
@@ -264,23 +238,7 @@
         <w:t xml:space="preserve">Right now, </w:t>
       </w:r>
       <w:r>
-        <w:t xml:space="preserve">there </w:t>
-      </w:r>
-      <w:proofErr w:type="gramStart"/>
-      <w:r>
-        <w:t>is</w:t>
-      </w:r>
-      <w:proofErr w:type="gramEnd"/>
-      <w:r>
-        <w:t xml:space="preserve"> 2 different </w:t>
-      </w:r>
-      <w:proofErr w:type="gramStart"/>
-      <w:r>
-        <w:t>file</w:t>
-      </w:r>
-      <w:proofErr w:type="gramEnd"/>
-      <w:r>
-        <w:t xml:space="preserve"> for the test, 1 for extraction of image context and the other one is to generate sample of a story telling from a prompt by the agent</w:t>
+        <w:t>there is 2 different file for the test, 1 for extraction of image context and the other one is to generate sample of a story telling from a prompt by the agent</w:t>
       </w:r>
       <w:r>
         <w:t>. The immediate next step is getting them to talk to each other seamlessly.</w:t>
@@ -324,23 +282,7 @@
         <w:t>the</w:t>
       </w:r>
       <w:r>
-        <w:t xml:space="preserve"> VLM </w:t>
-      </w:r>
-      <w:proofErr w:type="gramStart"/>
-      <w:r>
-        <w:t>output</w:t>
-      </w:r>
-      <w:proofErr w:type="gramEnd"/>
-      <w:r>
-        <w:t xml:space="preserve"> a structured format like JSON (e.g</w:t>
-      </w:r>
-      <w:proofErr w:type="gramStart"/>
-      <w:r>
-        <w:t>., {</w:t>
-      </w:r>
-      <w:proofErr w:type="gramEnd"/>
-      <w:r>
-        <w:t>"location": "tavern", "</w:t>
+        <w:t xml:space="preserve"> VLM output a structured format like JSON (e.g., {"location": "tavern", "</w:t>
       </w:r>
       <w:proofErr w:type="spellStart"/>
       <w:r>
@@ -356,15 +298,7 @@
       </w:r>
       <w:proofErr w:type="spellEnd"/>
       <w:r>
-        <w:t>": "</w:t>
-      </w:r>
-      <w:proofErr w:type="gramStart"/>
-      <w:r>
-        <w:t>low"}</w:t>
-      </w:r>
-      <w:proofErr w:type="gramEnd"/>
-      <w:r>
-        <w:t xml:space="preserve">). </w:t>
+        <w:t xml:space="preserve">": "low"}). </w:t>
       </w:r>
     </w:p>
     <w:p>
@@ -407,15 +341,7 @@
         <w:t xml:space="preserve"> /</w:t>
       </w:r>
       <w:r>
-        <w:t xml:space="preserve"> script where an image goes </w:t>
-      </w:r>
-      <w:proofErr w:type="gramStart"/>
-      <w:r>
-        <w:t>in</w:t>
-      </w:r>
-      <w:proofErr w:type="gramEnd"/>
-      <w:r>
-        <w:t xml:space="preserve"> one end, and a finished story comes out the other.</w:t>
+        <w:t xml:space="preserve"> script where an image goes in one end, and a finished story comes out the other.</w:t>
       </w:r>
     </w:p>
     <w:p>
@@ -609,15 +535,7 @@
         <w:t>Does the generated story accurately reflect the extracted game state? Is the tone consistent?</w:t>
       </w:r>
       <w:r>
-        <w:t xml:space="preserve"> I need to make sure that it follows Dr. Weeks </w:t>
-      </w:r>
-      <w:proofErr w:type="gramStart"/>
-      <w:r>
-        <w:t>advices</w:t>
-      </w:r>
-      <w:proofErr w:type="gramEnd"/>
-      <w:r>
-        <w:t xml:space="preserve"> of What makes a good storytelling such </w:t>
+        <w:t xml:space="preserve"> I need to make sure that it follows Dr. Weeks advices of What makes a good storytelling such </w:t>
       </w:r>
       <w:r>
         <w:t>as:</w:t>
@@ -721,23 +639,7 @@
           <w:b/>
           <w:bCs/>
         </w:rPr>
-        <w:t xml:space="preserve">Factors </w:t>
-      </w:r>
-      <w:proofErr w:type="gramStart"/>
-      <w:r>
-        <w:rPr>
-          <w:b/>
-          <w:bCs/>
-        </w:rPr>
-        <w:t>for</w:t>
-      </w:r>
-      <w:proofErr w:type="gramEnd"/>
-      <w:r>
-        <w:rPr>
-          <w:b/>
-          <w:bCs/>
-        </w:rPr>
-        <w:t xml:space="preserve"> the story</w:t>
+        <w:t>Factors for the story</w:t>
       </w:r>
     </w:p>
     <w:p>
@@ -766,6 +668,9 @@
       <w:r>
         <w:t>- degree of realism</w:t>
       </w:r>
+      <w:r>
+        <w:t xml:space="preserve"> (believability within the universe of the game)</w:t>
+      </w:r>
     </w:p>
     <w:p>
       <w:pPr>
@@ -774,6 +679,9 @@
       </w:pPr>
       <w:r>
         <w:t>- emotional richness</w:t>
+      </w:r>
+      <w:r>
+        <w:t xml:space="preserve"> (does it express it as a human or some factual events)</w:t>
       </w:r>
     </w:p>
     <w:p>
@@ -1071,7 +979,6 @@
       <w:r>
         <w:t>Notes from meeting of March 4</w:t>
       </w:r>
-      <w:proofErr w:type="gramStart"/>
       <w:r>
         <w:rPr>
           <w:vertAlign w:val="superscript"/>
@@ -1079,11 +986,7 @@
         <w:t>th</w:t>
       </w:r>
       <w:r>
-        <w:t xml:space="preserve"> ,</w:t>
-      </w:r>
-      <w:proofErr w:type="gramEnd"/>
-      <w:r>
-        <w:t xml:space="preserve"> 2026</w:t>
+        <w:t xml:space="preserve"> , 2026</w:t>
       </w:r>
     </w:p>
     <w:p/>
@@ -1095,15 +998,7 @@
         <w:t xml:space="preserve"> </w:t>
       </w:r>
       <w:r>
-        <w:t xml:space="preserve">Can </w:t>
-      </w:r>
-      <w:proofErr w:type="gramStart"/>
-      <w:r>
-        <w:t>a LLM</w:t>
-      </w:r>
-      <w:proofErr w:type="gramEnd"/>
-      <w:r>
-        <w:t xml:space="preserve"> generate a "good" story given a set of images?</w:t>
+        <w:t>Can a LLM generate a "good" story given a set of images?</w:t>
       </w:r>
     </w:p>
     <w:p>
@@ -1118,13 +1013,8 @@
     </w:p>
     <w:p>
       <w:r>
-        <w:t xml:space="preserve">Find a use case where this will be useful / </w:t>
-      </w:r>
-      <w:proofErr w:type="gramStart"/>
-      <w:r>
-        <w:t>acceptable  ?</w:t>
-      </w:r>
-      <w:proofErr w:type="gramEnd"/>
+        <w:t>Find a use case where this will be useful / acceptable  ?</w:t>
+      </w:r>
     </w:p>
     <w:p>
       <w:r>
@@ -1144,29 +1034,13 @@
         <w:t>A</w:t>
       </w:r>
       <w:r>
-        <w:t xml:space="preserve"> person is playing a </w:t>
-      </w:r>
-      <w:proofErr w:type="gramStart"/>
-      <w:r>
-        <w:t>game, and</w:t>
-      </w:r>
-      <w:proofErr w:type="gramEnd"/>
-      <w:r>
-        <w:t xml:space="preserve"> wants a follower to talk about what they did.</w:t>
+        <w:t xml:space="preserve"> person is playing a game, and wants a follower to talk about what they did.</w:t>
       </w:r>
       <w:r>
         <w:t xml:space="preserve"> </w:t>
       </w:r>
       <w:r>
-        <w:t xml:space="preserve">Imagine they (player and follower) are sitting at a campfire at </w:t>
-      </w:r>
-      <w:proofErr w:type="gramStart"/>
-      <w:r>
-        <w:t>night, and</w:t>
-      </w:r>
-      <w:proofErr w:type="gramEnd"/>
-      <w:r>
-        <w:t xml:space="preserve"> talking.</w:t>
+        <w:t>Imagine they (player and follower) are sitting at a campfire at night, and talking.</w:t>
       </w:r>
       <w:r>
         <w:t xml:space="preserve"> </w:t>
@@ -1192,15 +1066,7 @@
     <w:p/>
     <w:p>
       <w:r>
-        <w:t xml:space="preserve">Or a </w:t>
-      </w:r>
-      <w:proofErr w:type="gramStart"/>
-      <w:r>
-        <w:t>use case</w:t>
-      </w:r>
-      <w:proofErr w:type="gramEnd"/>
-      <w:r>
-        <w:t xml:space="preserve"> could </w:t>
+        <w:t xml:space="preserve">Or a use case could </w:t>
       </w:r>
       <w:r>
         <w:t>be</w:t>
@@ -1289,7 +1155,571 @@
       </w:hyperlink>
     </w:p>
     <w:p/>
+    <w:p>
+      <w:r>
+        <w:t xml:space="preserve">what is currently happening and need to be fixed </w:t>
+      </w:r>
+    </w:p>
+    <w:p>
+      <w:r>
+        <w:rPr>
+          <w:noProof/>
+        </w:rPr>
+        <mc:AlternateContent>
+          <mc:Choice Requires="wpi">
+            <w:drawing>
+              <wp:anchor distT="0" distB="0" distL="114300" distR="114300" simplePos="0" relativeHeight="251664384" behindDoc="0" locked="0" layoutInCell="1" allowOverlap="1" wp14:anchorId="4CA74F23" wp14:editId="04026230">
+                <wp:simplePos x="0" y="0"/>
+                <wp:positionH relativeFrom="column">
+                  <wp:posOffset>1904880</wp:posOffset>
+                </wp:positionH>
+                <wp:positionV relativeFrom="paragraph">
+                  <wp:posOffset>1110555</wp:posOffset>
+                </wp:positionV>
+                <wp:extent cx="1942560" cy="360"/>
+                <wp:effectExtent l="76200" t="57150" r="57785" b="76200"/>
+                <wp:wrapNone/>
+                <wp:docPr id="1765386976" name="Ink 8"/>
+                <wp:cNvGraphicFramePr/>
+                <a:graphic xmlns:a="http://schemas.openxmlformats.org/drawingml/2006/main">
+                  <a:graphicData uri="http://schemas.microsoft.com/office/word/2010/wordprocessingInk">
+                    <w14:contentPart bwMode="auto" r:id="rId10">
+                      <w14:nvContentPartPr>
+                        <w14:cNvContentPartPr/>
+                      </w14:nvContentPartPr>
+                      <w14:xfrm>
+                        <a:off x="0" y="0"/>
+                        <a:ext cx="1942560" cy="360"/>
+                      </w14:xfrm>
+                    </w14:contentPart>
+                  </a:graphicData>
+                </a:graphic>
+              </wp:anchor>
+            </w:drawing>
+          </mc:Choice>
+          <mc:Fallback>
+            <w:pict>
+              <v:shapetype w14:anchorId="291F4582" id="_x0000_t75" coordsize="21600,21600" o:spt="75" o:preferrelative="t" path="m@4@5l@4@11@9@11@9@5xe" filled="f" stroked="f">
+                <v:stroke joinstyle="miter"/>
+                <v:formulas>
+                  <v:f eqn="if lineDrawn pixelLineWidth 0"/>
+                  <v:f eqn="sum @0 1 0"/>
+                  <v:f eqn="sum 0 0 @1"/>
+                  <v:f eqn="prod @2 1 2"/>
+                  <v:f eqn="prod @3 21600 pixelWidth"/>
+                  <v:f eqn="prod @3 21600 pixelHeight"/>
+                  <v:f eqn="sum @0 0 1"/>
+                  <v:f eqn="prod @6 1 2"/>
+                  <v:f eqn="prod @7 21600 pixelWidth"/>
+                  <v:f eqn="sum @8 21600 0"/>
+                  <v:f eqn="prod @7 21600 pixelHeight"/>
+                  <v:f eqn="sum @10 21600 0"/>
+                </v:formulas>
+                <v:path o:extrusionok="f" gradientshapeok="t" o:connecttype="rect"/>
+                <o:lock v:ext="edit" aspectratio="t"/>
+              </v:shapetype>
+              <v:shape id="Ink 8" o:spid="_x0000_s1026" type="#_x0000_t75" style="position:absolute;margin-left:148.6pt;margin-top:86.05pt;width:155.75pt;height:2.9pt;z-index:251664384;visibility:visible;mso-wrap-style:square;mso-wrap-distance-left:9pt;mso-wrap-distance-top:0;mso-wrap-distance-right:9pt;mso-wrap-distance-bottom:0;mso-position-horizontal:absolute;mso-position-horizontal-relative:text;mso-position-vertical:absolute;mso-position-vertical-relative:text" o:gfxdata="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">
+                <v:imagedata r:id="rId11" o:title=""/>
+              </v:shape>
+            </w:pict>
+          </mc:Fallback>
+        </mc:AlternateContent>
+      </w:r>
+      <w:r>
+        <w:rPr>
+          <w:noProof/>
+        </w:rPr>
+        <mc:AlternateContent>
+          <mc:Choice Requires="wpi">
+            <w:drawing>
+              <wp:anchor distT="0" distB="0" distL="114300" distR="114300" simplePos="0" relativeHeight="251663360" behindDoc="0" locked="0" layoutInCell="1" allowOverlap="1" wp14:anchorId="514C52CD" wp14:editId="39F2126B">
+                <wp:simplePos x="0" y="0"/>
+                <wp:positionH relativeFrom="column">
+                  <wp:posOffset>1957440</wp:posOffset>
+                </wp:positionH>
+                <wp:positionV relativeFrom="paragraph">
+                  <wp:posOffset>1147275</wp:posOffset>
+                </wp:positionV>
+                <wp:extent cx="1936440" cy="62640"/>
+                <wp:effectExtent l="0" t="76200" r="6985" b="71120"/>
+                <wp:wrapNone/>
+                <wp:docPr id="5527728" name="Ink 7"/>
+                <wp:cNvGraphicFramePr/>
+                <a:graphic xmlns:a="http://schemas.openxmlformats.org/drawingml/2006/main">
+                  <a:graphicData uri="http://schemas.microsoft.com/office/word/2010/wordprocessingInk">
+                    <w14:contentPart bwMode="auto" r:id="rId12">
+                      <w14:nvContentPartPr>
+                        <w14:cNvContentPartPr/>
+                      </w14:nvContentPartPr>
+                      <w14:xfrm>
+                        <a:off x="0" y="0"/>
+                        <a:ext cx="1936440" cy="62640"/>
+                      </w14:xfrm>
+                    </w14:contentPart>
+                  </a:graphicData>
+                </a:graphic>
+              </wp:anchor>
+            </w:drawing>
+          </mc:Choice>
+          <mc:Fallback>
+            <w:pict>
+              <v:shape w14:anchorId="70C1F079" id="Ink 7" o:spid="_x0000_s1026" type="#_x0000_t75" style="position:absolute;margin-left:152.75pt;margin-top:88.95pt;width:155.35pt;height:7.8pt;z-index:251663360;visibility:visible;mso-wrap-style:square;mso-wrap-distance-left:9pt;mso-wrap-distance-top:0;mso-wrap-distance-right:9pt;mso-wrap-distance-bottom:0;mso-position-horizontal:absolute;mso-position-horizontal-relative:text;mso-position-vertical:absolute;mso-position-vertical-relative:text" o:gfxdata="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">
+                <v:imagedata r:id="rId13" o:title=""/>
+              </v:shape>
+            </w:pict>
+          </mc:Fallback>
+        </mc:AlternateContent>
+      </w:r>
+      <w:r>
+        <w:rPr>
+          <w:noProof/>
+        </w:rPr>
+        <mc:AlternateContent>
+          <mc:Choice Requires="wpi">
+            <w:drawing>
+              <wp:anchor distT="0" distB="0" distL="114300" distR="114300" simplePos="0" relativeHeight="251662336" behindDoc="0" locked="0" layoutInCell="1" allowOverlap="1" wp14:anchorId="11B5AF6F" wp14:editId="4EBA2061">
+                <wp:simplePos x="0" y="0"/>
+                <wp:positionH relativeFrom="column">
+                  <wp:posOffset>1805520</wp:posOffset>
+                </wp:positionH>
+                <wp:positionV relativeFrom="paragraph">
+                  <wp:posOffset>1125675</wp:posOffset>
+                </wp:positionV>
+                <wp:extent cx="2096135" cy="635"/>
+                <wp:effectExtent l="57150" t="76200" r="56515" b="75565"/>
+                <wp:wrapNone/>
+                <wp:docPr id="1975994916" name="Ink 6"/>
+                <wp:cNvGraphicFramePr/>
+                <a:graphic xmlns:a="http://schemas.openxmlformats.org/drawingml/2006/main">
+                  <a:graphicData uri="http://schemas.microsoft.com/office/word/2010/wordprocessingInk">
+                    <w14:contentPart bwMode="auto" r:id="rId14">
+                      <w14:nvContentPartPr>
+                        <w14:cNvContentPartPr/>
+                      </w14:nvContentPartPr>
+                      <w14:xfrm>
+                        <a:off x="0" y="0"/>
+                        <a:ext cx="2096135" cy="635"/>
+                      </w14:xfrm>
+                    </w14:contentPart>
+                  </a:graphicData>
+                </a:graphic>
+                <wp14:sizeRelH relativeFrom="margin">
+                  <wp14:pctWidth>0</wp14:pctWidth>
+                </wp14:sizeRelH>
+                <wp14:sizeRelV relativeFrom="margin">
+                  <wp14:pctHeight>0</wp14:pctHeight>
+                </wp14:sizeRelV>
+              </wp:anchor>
+            </w:drawing>
+          </mc:Choice>
+          <mc:Fallback>
+            <w:pict>
+              <v:shape w14:anchorId="5D238784" id="Ink 6" o:spid="_x0000_s1026" type="#_x0000_t75" style="position:absolute;margin-left:140.75pt;margin-top:86.15pt;width:167.85pt;height:5pt;z-index:251662336;visibility:visible;mso-wrap-style:square;mso-width-percent:0;mso-height-percent:0;mso-wrap-distance-left:9pt;mso-wrap-distance-top:0;mso-wrap-distance-right:9pt;mso-wrap-distance-bottom:0;mso-position-horizontal:absolute;mso-position-horizontal-relative:text;mso-position-vertical:absolute;mso-position-vertical-relative:text;mso-width-percent:0;mso-height-percent:0;mso-width-relative:margin;mso-height-relative:margin" o:gfxdata="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">
+                <v:imagedata r:id="rId15" o:title=""/>
+              </v:shape>
+            </w:pict>
+          </mc:Fallback>
+        </mc:AlternateContent>
+      </w:r>
+      <w:r>
+        <w:rPr>
+          <w:noProof/>
+        </w:rPr>
+        <mc:AlternateContent>
+          <mc:Choice Requires="wpi">
+            <w:drawing>
+              <wp:anchor distT="0" distB="0" distL="114300" distR="114300" simplePos="0" relativeHeight="251660288" behindDoc="0" locked="0" layoutInCell="1" allowOverlap="1" wp14:anchorId="48D49C76" wp14:editId="71CBCB93">
+                <wp:simplePos x="0" y="0"/>
+                <wp:positionH relativeFrom="column">
+                  <wp:posOffset>1821360</wp:posOffset>
+                </wp:positionH>
+                <wp:positionV relativeFrom="paragraph">
+                  <wp:posOffset>1139715</wp:posOffset>
+                </wp:positionV>
+                <wp:extent cx="144360" cy="9360"/>
+                <wp:effectExtent l="57150" t="57150" r="65405" b="67310"/>
+                <wp:wrapNone/>
+                <wp:docPr id="78417459" name="Ink 4"/>
+                <wp:cNvGraphicFramePr/>
+                <a:graphic xmlns:a="http://schemas.openxmlformats.org/drawingml/2006/main">
+                  <a:graphicData uri="http://schemas.microsoft.com/office/word/2010/wordprocessingInk">
+                    <w14:contentPart bwMode="auto" r:id="rId16">
+                      <w14:nvContentPartPr>
+                        <w14:cNvContentPartPr/>
+                      </w14:nvContentPartPr>
+                      <w14:xfrm>
+                        <a:off x="0" y="0"/>
+                        <a:ext cx="144360" cy="9360"/>
+                      </w14:xfrm>
+                    </w14:contentPart>
+                  </a:graphicData>
+                </a:graphic>
+              </wp:anchor>
+            </w:drawing>
+          </mc:Choice>
+          <mc:Fallback>
+            <w:pict>
+              <v:shape w14:anchorId="5848F530" id="Ink 4" o:spid="_x0000_s1026" type="#_x0000_t75" style="position:absolute;margin-left:142pt;margin-top:88.35pt;width:14.15pt;height:3.6pt;z-index:251660288;visibility:visible;mso-wrap-style:square;mso-wrap-distance-left:9pt;mso-wrap-distance-top:0;mso-wrap-distance-right:9pt;mso-wrap-distance-bottom:0;mso-position-horizontal:absolute;mso-position-horizontal-relative:text;mso-position-vertical:absolute;mso-position-vertical-relative:text" o:gfxdata="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">
+                <v:imagedata r:id="rId17" o:title=""/>
+              </v:shape>
+            </w:pict>
+          </mc:Fallback>
+        </mc:AlternateContent>
+      </w:r>
+      <w:r>
+        <w:rPr>
+          <w:noProof/>
+        </w:rPr>
+        <mc:AlternateContent>
+          <mc:Choice Requires="wpi">
+            <w:drawing>
+              <wp:anchor distT="0" distB="0" distL="114300" distR="114300" simplePos="0" relativeHeight="251659264" behindDoc="0" locked="0" layoutInCell="1" allowOverlap="1" wp14:anchorId="5A82F458" wp14:editId="4F43835F">
+                <wp:simplePos x="0" y="0"/>
+                <wp:positionH relativeFrom="column">
+                  <wp:posOffset>1874280</wp:posOffset>
+                </wp:positionH>
+                <wp:positionV relativeFrom="paragraph">
+                  <wp:posOffset>1141155</wp:posOffset>
+                </wp:positionV>
+                <wp:extent cx="360" cy="360"/>
+                <wp:effectExtent l="38100" t="38100" r="38100" b="38100"/>
+                <wp:wrapNone/>
+                <wp:docPr id="107110776" name="Ink 1"/>
+                <wp:cNvGraphicFramePr/>
+                <a:graphic xmlns:a="http://schemas.openxmlformats.org/drawingml/2006/main">
+                  <a:graphicData uri="http://schemas.microsoft.com/office/word/2010/wordprocessingInk">
+                    <w14:contentPart bwMode="auto" r:id="rId18">
+                      <w14:nvContentPartPr>
+                        <w14:cNvContentPartPr/>
+                      </w14:nvContentPartPr>
+                      <w14:xfrm>
+                        <a:off x="0" y="0"/>
+                        <a:ext cx="360" cy="360"/>
+                      </w14:xfrm>
+                    </w14:contentPart>
+                  </a:graphicData>
+                </a:graphic>
+              </wp:anchor>
+            </w:drawing>
+          </mc:Choice>
+          <mc:Fallback>
+            <w:pict>
+              <v:shape w14:anchorId="069ED002" id="Ink 1" o:spid="_x0000_s1026" type="#_x0000_t75" style="position:absolute;margin-left:147.1pt;margin-top:89.35pt;width:1.05pt;height:1.05pt;z-index:251659264;visibility:visible;mso-wrap-style:square;mso-wrap-distance-left:9pt;mso-wrap-distance-top:0;mso-wrap-distance-right:9pt;mso-wrap-distance-bottom:0;mso-position-horizontal:absolute;mso-position-horizontal-relative:text;mso-position-vertical:absolute;mso-position-vertical-relative:text" o:gfxdata="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">
+                <v:imagedata r:id="rId19" o:title=""/>
+              </v:shape>
+            </w:pict>
+          </mc:Fallback>
+        </mc:AlternateContent>
+      </w:r>
+      <w:r>
+        <w:rPr>
+          <w:noProof/>
+        </w:rPr>
+        <w:drawing>
+          <wp:inline distT="0" distB="0" distL="0" distR="0" wp14:anchorId="69E811CA" wp14:editId="671BB018">
+            <wp:extent cx="5943600" cy="2120900"/>
+            <wp:effectExtent l="0" t="0" r="0" b="0"/>
+            <wp:docPr id="1858904272" name="Picture 1"/>
+            <wp:cNvGraphicFramePr>
+              <a:graphicFrameLocks xmlns:a="http://schemas.openxmlformats.org/drawingml/2006/main" noChangeAspect="1"/>
+            </wp:cNvGraphicFramePr>
+            <a:graphic xmlns:a="http://schemas.openxmlformats.org/drawingml/2006/main">
+              <a:graphicData uri="http://schemas.openxmlformats.org/drawingml/2006/picture">
+                <pic:pic xmlns:pic="http://schemas.openxmlformats.org/drawingml/2006/picture">
+                  <pic:nvPicPr>
+                    <pic:cNvPr id="1858904272" name=""/>
+                    <pic:cNvPicPr/>
+                  </pic:nvPicPr>
+                  <pic:blipFill>
+                    <a:blip r:embed="rId20"/>
+                    <a:stretch>
+                      <a:fillRect/>
+                    </a:stretch>
+                  </pic:blipFill>
+                  <pic:spPr>
+                    <a:xfrm>
+                      <a:off x="0" y="0"/>
+                      <a:ext cx="5943600" cy="2120900"/>
+                    </a:xfrm>
+                    <a:prstGeom prst="rect">
+                      <a:avLst/>
+                    </a:prstGeom>
+                  </pic:spPr>
+                </pic:pic>
+              </a:graphicData>
+            </a:graphic>
+          </wp:inline>
+        </w:drawing>
+      </w:r>
+    </w:p>
     <w:p/>
+    <w:p>
+      <w:r>
+        <w:lastRenderedPageBreak/>
+        <w:t>It has been fixed on Tuesday, Apr  14</w:t>
+      </w:r>
+      <w:r>
+        <w:rPr>
+          <w:vertAlign w:val="superscript"/>
+        </w:rPr>
+        <w:t>th</w:t>
+      </w:r>
+      <w:r>
+        <w:t xml:space="preserve"> with revised code for the </w:t>
+      </w:r>
+      <w:proofErr w:type="spellStart"/>
+      <w:r>
+        <w:t>llm</w:t>
+      </w:r>
+      <w:proofErr w:type="spellEnd"/>
+      <w:r>
+        <w:t xml:space="preserve"> as a judge and we already have the generated stories.</w:t>
+      </w:r>
+      <w:r>
+        <w:br/>
+      </w:r>
+      <w:r>
+        <w:br/>
+        <w:t xml:space="preserve">plotting evaluation needs human scoring at last </w:t>
+      </w:r>
+      <w:r>
+        <w:br/>
+        <w:t>need at least 3 person to evaluate</w:t>
+      </w:r>
+    </w:p>
+    <w:p/>
+    <w:p/>
+    <w:p>
+      <w:r>
+        <w:drawing>
+          <wp:inline distT="0" distB="0" distL="0" distR="0" wp14:anchorId="5CA0E2D0" wp14:editId="2D4DC441">
+            <wp:extent cx="5943600" cy="1890395"/>
+            <wp:effectExtent l="0" t="0" r="0" b="0"/>
+            <wp:docPr id="1810729634" name="Picture 1"/>
+            <wp:cNvGraphicFramePr>
+              <a:graphicFrameLocks xmlns:a="http://schemas.openxmlformats.org/drawingml/2006/main" noChangeAspect="1"/>
+            </wp:cNvGraphicFramePr>
+            <a:graphic xmlns:a="http://schemas.openxmlformats.org/drawingml/2006/main">
+              <a:graphicData uri="http://schemas.openxmlformats.org/drawingml/2006/picture">
+                <pic:pic xmlns:pic="http://schemas.openxmlformats.org/drawingml/2006/picture">
+                  <pic:nvPicPr>
+                    <pic:cNvPr id="1810729634" name=""/>
+                    <pic:cNvPicPr/>
+                  </pic:nvPicPr>
+                  <pic:blipFill>
+                    <a:blip r:embed="rId21"/>
+                    <a:stretch>
+                      <a:fillRect/>
+                    </a:stretch>
+                  </pic:blipFill>
+                  <pic:spPr>
+                    <a:xfrm>
+                      <a:off x="0" y="0"/>
+                      <a:ext cx="5943600" cy="1890395"/>
+                    </a:xfrm>
+                    <a:prstGeom prst="rect">
+                      <a:avLst/>
+                    </a:prstGeom>
+                  </pic:spPr>
+                </pic:pic>
+              </a:graphicData>
+            </a:graphic>
+          </wp:inline>
+        </w:drawing>
+      </w:r>
+      <w:r>
+        <w:t xml:space="preserve"> </w:t>
+      </w:r>
+    </w:p>
+    <w:p>
+      <w:r>
+        <w:t xml:space="preserve">Paste this prompt into the report </w:t>
+      </w:r>
+      <w:r>
+        <w:br/>
+      </w:r>
+      <w:r>
+        <w:br/>
+        <w:t>also copy it as a text</w:t>
+      </w:r>
+    </w:p>
+    <w:p/>
+    <w:p>
+      <w:r>
+        <w:t xml:space="preserve">Also precise in the prompt that in the scale from 1 to 5 with 1 being bad and 5 best </w:t>
+      </w:r>
+    </w:p>
+    <w:p>
+      <w:pPr>
+        <w:pStyle w:val="ListParagraph"/>
+        <w:numPr>
+          <w:ilvl w:val="1"/>
+          <w:numId w:val="3"/>
+        </w:numPr>
+      </w:pPr>
+      <w:r>
+        <w:t>Precise the length of the story to the LLM</w:t>
+      </w:r>
+    </w:p>
+    <w:p>
+      <w:pPr>
+        <w:pStyle w:val="ListParagraph"/>
+        <w:numPr>
+          <w:ilvl w:val="1"/>
+          <w:numId w:val="3"/>
+        </w:numPr>
+      </w:pPr>
+      <w:r>
+        <w:t xml:space="preserve">Is the story a recap (currently yes) </w:t>
+      </w:r>
+    </w:p>
+    <w:p>
+      <w:pPr>
+        <w:pStyle w:val="ListParagraph"/>
+        <w:numPr>
+          <w:ilvl w:val="1"/>
+          <w:numId w:val="3"/>
+        </w:numPr>
+      </w:pPr>
+      <w:r>
+        <w:t xml:space="preserve">what is our goal the </w:t>
+      </w:r>
+      <w:proofErr w:type="spellStart"/>
+      <w:r>
+        <w:t>llm</w:t>
+      </w:r>
+      <w:proofErr w:type="spellEnd"/>
+      <w:r>
+        <w:t xml:space="preserve"> is trying to achieve ? </w:t>
+      </w:r>
+    </w:p>
+    <w:p>
+      <w:pPr>
+        <w:pStyle w:val="ListParagraph"/>
+        <w:numPr>
+          <w:ilvl w:val="1"/>
+          <w:numId w:val="3"/>
+        </w:numPr>
+      </w:pPr>
+      <w:r>
+        <w:t>for future improvement (try )</w:t>
+      </w:r>
+    </w:p>
+    <w:p>
+      <w:pPr>
+        <w:pStyle w:val="ListParagraph"/>
+        <w:numPr>
+          <w:ilvl w:val="1"/>
+          <w:numId w:val="3"/>
+        </w:numPr>
+      </w:pPr>
+      <w:r>
+        <w:t xml:space="preserve">include length </w:t>
+      </w:r>
+      <w:r>
+        <w:t>(talk about length, and why we are evaluating it?)</w:t>
+      </w:r>
+      <w:r>
+        <w:t xml:space="preserve"> (not have to but explain why not including it)</w:t>
+      </w:r>
+    </w:p>
+    <w:p>
+      <w:pPr>
+        <w:pStyle w:val="ListParagraph"/>
+        <w:numPr>
+          <w:ilvl w:val="1"/>
+          <w:numId w:val="3"/>
+        </w:numPr>
+      </w:pPr>
+      <w:r>
+        <w:t xml:space="preserve">include this ref to bibliography =&gt; </w:t>
+      </w:r>
+      <w:r>
+        <w:t xml:space="preserve">Ernest Adams, </w:t>
+      </w:r>
+      <w:r>
+        <w:rPr>
+          <w:i/>
+          <w:iCs/>
+        </w:rPr>
+        <w:t>Fundamentals of Game Design</w:t>
+      </w:r>
+      <w:r>
+        <w:t xml:space="preserve"> (3rd ed), Pearson, 2014, </w:t>
+      </w:r>
+      <w:hyperlink r:id="rId22" w:history="1">
+        <w:r>
+          <w:rPr>
+            <w:rStyle w:val="Hyperlink"/>
+          </w:rPr>
+          <w:t>ISBN-10: 0321929675</w:t>
+        </w:r>
+      </w:hyperlink>
+      <w:r>
+        <w:t>, ISBN-13: 978-0321929679.</w:t>
+      </w:r>
+    </w:p>
+    <w:p>
+      <w:pPr>
+        <w:pStyle w:val="ListParagraph"/>
+        <w:numPr>
+          <w:ilvl w:val="1"/>
+          <w:numId w:val="3"/>
+        </w:numPr>
+      </w:pPr>
+      <w:r>
+        <w:t xml:space="preserve">Include credibility in the scoring </w:t>
+      </w:r>
+    </w:p>
+    <w:p>
+      <w:pPr>
+        <w:pStyle w:val="ListParagraph"/>
+        <w:numPr>
+          <w:ilvl w:val="1"/>
+          <w:numId w:val="3"/>
+        </w:numPr>
+      </w:pPr>
+      <w:r>
+        <w:t xml:space="preserve">Include repetition  in the scoring too </w:t>
+      </w:r>
+    </w:p>
+    <w:p>
+      <w:pPr>
+        <w:pStyle w:val="ListParagraph"/>
+        <w:numPr>
+          <w:ilvl w:val="1"/>
+          <w:numId w:val="3"/>
+        </w:numPr>
+      </w:pPr>
+      <w:r>
+        <w:t>Include arbitrary content scoring too (by arbitrary we mean not talking about not necessary things like “as you come close to the enemy the health bar is growing”)</w:t>
+      </w:r>
+    </w:p>
+    <w:p>
+      <w:pPr>
+        <w:pStyle w:val="ListParagraph"/>
+        <w:numPr>
+          <w:ilvl w:val="1"/>
+          <w:numId w:val="3"/>
+        </w:numPr>
+      </w:pPr>
+      <w:r>
+        <w:lastRenderedPageBreak/>
+        <w:t xml:space="preserve">Emotional richness to include </w:t>
+      </w:r>
+    </w:p>
+    <w:p>
+      <w:pPr>
+        <w:pStyle w:val="ListParagraph"/>
+        <w:numPr>
+          <w:ilvl w:val="0"/>
+          <w:numId w:val="3"/>
+        </w:numPr>
+      </w:pPr>
+      <w:r>
+        <w:t xml:space="preserve">In total 8 scoring </w:t>
+      </w:r>
+    </w:p>
     <w:sectPr>
       <w:pgSz w:w="12240" w:h="15840"/>
       <w:pgMar w:top="1440" w:right="1440" w:bottom="1440" w:left="1440" w:header="720" w:footer="720" w:gutter="0"/>
@@ -2511,7 +2941,6 @@
   <w:style w:type="character" w:default="1" w:styleId="DefaultParagraphFont">
     <w:name w:val="Default Paragraph Font"/>
     <w:uiPriority w:val="1"/>
-    <w:semiHidden/>
     <w:unhideWhenUsed/>
   </w:style>
   <w:style w:type="table" w:default="1" w:styleId="TableNormal">
@@ -2862,6 +3291,145 @@
 </w:styles>
 </file>
 
+<file path=word/ink/ink1.xml><?xml version="1.0" encoding="utf-8"?>
+<inkml:ink xmlns:inkml="http://www.w3.org/2003/InkML">
+  <inkml:definitions>
+    <inkml:context xml:id="ctx0">
+      <inkml:inkSource xml:id="inkSrc0">
+        <inkml:traceFormat>
+          <inkml:channel name="X" type="integer" min="-2.14748E9" max="2.14748E9" units="cm"/>
+          <inkml:channel name="Y" type="integer" min="-2.14748E9" max="2.14748E9" units="cm"/>
+          <inkml:channel name="F" type="integer" max="32767" units="dev"/>
+        </inkml:traceFormat>
+        <inkml:channelProperties>
+          <inkml:channelProperty channel="X" name="resolution" value="1000" units="1/cm"/>
+          <inkml:channelProperty channel="Y" name="resolution" value="1000" units="1/cm"/>
+          <inkml:channelProperty channel="F" name="resolution" value="0" units="1/dev"/>
+        </inkml:channelProperties>
+      </inkml:inkSource>
+      <inkml:timestamp xml:id="ts0" timeString="2026-04-15T18:55:42.738"/>
+    </inkml:context>
+    <inkml:brush xml:id="br0">
+      <inkml:brushProperty name="width" value="0.1" units="cm"/>
+      <inkml:brushProperty name="height" value="0.1" units="cm"/>
+      <inkml:brushProperty name="color" value="#333333"/>
+    </inkml:brush>
+  </inkml:definitions>
+  <inkml:trace contextRef="#ctx0" brushRef="#br0">0 0 24575,'5377'0'-1365,"-5359"0"-5461</inkml:trace>
+</inkml:ink>
+</file>
+
+<file path=word/ink/ink2.xml><?xml version="1.0" encoding="utf-8"?>
+<inkml:ink xmlns:inkml="http://www.w3.org/2003/InkML">
+  <inkml:definitions>
+    <inkml:context xml:id="ctx0">
+      <inkml:inkSource xml:id="inkSrc0">
+        <inkml:traceFormat>
+          <inkml:channel name="X" type="integer" min="-2.14748E9" max="2.14748E9" units="cm"/>
+          <inkml:channel name="Y" type="integer" min="-2.14748E9" max="2.14748E9" units="cm"/>
+          <inkml:channel name="F" type="integer" max="32767" units="dev"/>
+        </inkml:traceFormat>
+        <inkml:channelProperties>
+          <inkml:channelProperty channel="X" name="resolution" value="1000" units="1/cm"/>
+          <inkml:channelProperty channel="Y" name="resolution" value="1000" units="1/cm"/>
+          <inkml:channelProperty channel="F" name="resolution" value="0" units="1/dev"/>
+        </inkml:channelProperties>
+      </inkml:inkSource>
+      <inkml:timestamp xml:id="ts0" timeString="2026-04-15T18:55:40.096"/>
+    </inkml:context>
+    <inkml:brush xml:id="br0">
+      <inkml:brushProperty name="width" value="0.1" units="cm"/>
+      <inkml:brushProperty name="height" value="0.1" units="cm"/>
+      <inkml:brushProperty name="color" value="#333333"/>
+    </inkml:brush>
+  </inkml:definitions>
+  <inkml:trace contextRef="#ctx0" brushRef="#br0">5379 89 24575,'0'1'0,"-1"0"0,1 0 0,-1-1 0,0 1 0,1 0 0,-1 0 0,1-1 0,-1 1 0,0 0 0,0-1 0,1 1 0,-1-1 0,0 1 0,0-1 0,0 1 0,0-1 0,0 0 0,0 1 0,1-1 0,-1 0 0,0 0 0,-2 1 0,-27 5 0,24-5 0,-76 11 0,0-4 0,0-4 0,-94-7 0,-90 5 0,129 18 0,75-12 0,18-1 0,0-3 0,-87-2 0,116-6 0,20-2 0,33-5 0,49 2 0,90 3 0,-91 5 0,127-18 0,-171 9 0,0-1 0,53-23 0,32-10 0,-108 40 0,-1 0 0,0 0 0,1 2 0,37 0 0,-349 2 0,123 2 0,70-4 0,36 0 0,-105 10 0,84 10 0,63-12 0,-1-1 0,1 0 0,-33 1 0,-658-6 0,322-2 0,-2075 2 0,2324-11 0,-3 0 0,-221 12-1365,348-1-5461</inkml:trace>
+</inkml:ink>
+</file>
+
+<file path=word/ink/ink3.xml><?xml version="1.0" encoding="utf-8"?>
+<inkml:ink xmlns:inkml="http://www.w3.org/2003/InkML">
+  <inkml:definitions>
+    <inkml:context xml:id="ctx0">
+      <inkml:inkSource xml:id="inkSrc0">
+        <inkml:traceFormat>
+          <inkml:channel name="X" type="integer" min="-2.14748E9" max="2.14748E9" units="cm"/>
+          <inkml:channel name="Y" type="integer" min="-2.14748E9" max="2.14748E9" units="cm"/>
+          <inkml:channel name="F" type="integer" max="32767" units="dev"/>
+        </inkml:traceFormat>
+        <inkml:channelProperties>
+          <inkml:channelProperty channel="X" name="resolution" value="1000" units="1/cm"/>
+          <inkml:channelProperty channel="Y" name="resolution" value="1000" units="1/cm"/>
+          <inkml:channelProperty channel="F" name="resolution" value="0" units="1/dev"/>
+        </inkml:channelProperties>
+      </inkml:inkSource>
+      <inkml:timestamp xml:id="ts0" timeString="2026-04-15T18:55:33.639"/>
+    </inkml:context>
+    <inkml:brush xml:id="br0">
+      <inkml:brushProperty name="width" value="0.1" units="cm"/>
+      <inkml:brushProperty name="height" value="0.1" units="cm"/>
+      <inkml:brushProperty name="color" value="#333333"/>
+    </inkml:brush>
+  </inkml:definitions>
+  <inkml:trace contextRef="#ctx0" brushRef="#br0">0 0 24484,'5823'0'0</inkml:trace>
+</inkml:ink>
+</file>
+
+<file path=word/ink/ink4.xml><?xml version="1.0" encoding="utf-8"?>
+<inkml:ink xmlns:inkml="http://www.w3.org/2003/InkML">
+  <inkml:definitions>
+    <inkml:context xml:id="ctx0">
+      <inkml:inkSource xml:id="inkSrc0">
+        <inkml:traceFormat>
+          <inkml:channel name="X" type="integer" min="-2.14748E9" max="2.14748E9" units="cm"/>
+          <inkml:channel name="Y" type="integer" min="-2.14748E9" max="2.14748E9" units="cm"/>
+          <inkml:channel name="F" type="integer" max="32767" units="dev"/>
+        </inkml:traceFormat>
+        <inkml:channelProperties>
+          <inkml:channelProperty channel="X" name="resolution" value="1000" units="1/cm"/>
+          <inkml:channelProperty channel="Y" name="resolution" value="1000" units="1/cm"/>
+          <inkml:channelProperty channel="F" name="resolution" value="0" units="1/dev"/>
+        </inkml:channelProperties>
+      </inkml:inkSource>
+      <inkml:timestamp xml:id="ts0" timeString="2026-04-15T18:55:30.518"/>
+    </inkml:context>
+    <inkml:brush xml:id="br0">
+      <inkml:brushProperty name="width" value="0.1" units="cm"/>
+      <inkml:brushProperty name="height" value="0.1" units="cm"/>
+      <inkml:brushProperty name="color" value="#333333"/>
+    </inkml:brush>
+  </inkml:definitions>
+  <inkml:trace contextRef="#ctx0" brushRef="#br0">0 25 24575,'30'-1'0,"47"-9"0,-46 5 0,44-1 0,-18 8-31,-38 0-236,0-1 0,0-1 1,0-1-1,35-6 0</inkml:trace>
+</inkml:ink>
+</file>
+
+<file path=word/ink/ink5.xml><?xml version="1.0" encoding="utf-8"?>
+<inkml:ink xmlns:inkml="http://www.w3.org/2003/InkML">
+  <inkml:definitions>
+    <inkml:context xml:id="ctx0">
+      <inkml:inkSource xml:id="inkSrc0">
+        <inkml:traceFormat>
+          <inkml:channel name="X" type="integer" min="-2.14748E9" max="2.14748E9" units="cm"/>
+          <inkml:channel name="Y" type="integer" min="-2.14748E9" max="2.14748E9" units="cm"/>
+          <inkml:channel name="F" type="integer" max="32767" units="dev"/>
+        </inkml:traceFormat>
+        <inkml:channelProperties>
+          <inkml:channelProperty channel="X" name="resolution" value="1000" units="1/cm"/>
+          <inkml:channelProperty channel="Y" name="resolution" value="1000" units="1/cm"/>
+          <inkml:channelProperty channel="F" name="resolution" value="0" units="1/dev"/>
+        </inkml:channelProperties>
+      </inkml:inkSource>
+      <inkml:timestamp xml:id="ts0" timeString="2026-04-15T18:55:17.574"/>
+    </inkml:context>
+    <inkml:brush xml:id="br0">
+      <inkml:brushProperty name="width" value="0.035" units="cm"/>
+      <inkml:brushProperty name="height" value="0.035" units="cm"/>
+    </inkml:brush>
+  </inkml:definitions>
+  <inkml:trace contextRef="#ctx0" brushRef="#br0">1 0 24575,'0'0'-8191</inkml:trace>
+</inkml:ink>
+</file>
+
 <file path=word/theme/theme1.xml><?xml version="1.0" encoding="utf-8"?>
 <a:theme xmlns:a="http://schemas.openxmlformats.org/drawingml/2006/main" name="Office Theme">
   <a:themeElements>

</xml_diff>